<commit_message>
Update contract car template
</commit_message>
<xml_diff>
--- a/public/files/contract_car_template.docx
+++ b/public/files/contract_car_template.docx
@@ -8267,7 +8267,25 @@
           <w:szCs w:val="18"/>
           <w:lang w:val="hy-AM"/>
         </w:rPr>
-        <w:t xml:space="preserve">Գրավի առարկայի իրացումից ստացված միջոցների հաշվին մարվում են իրացման օրվա դրությամբ Վարկատուի հանդեպ Վարկառուի ունեցած պարտավորությունները։ Եթե ստացված միջոցները գերազանցում են Վարկառուի իրացման օրվա դրությամբ ունեցած պարտավորությունները ապա գերազանցող մասը փոխանցվում է Վարկառուի բանկային հաշվեհամարին։ Եթե իրացումից ստացված միջոցները բավարար չեն պարտավորությունների ամբողջական կատարման համար Վարկառուն իրավունք ունի օրենքով սահմանված կարգով Վարկառուից պահանջել չմարված վճարային պարտավորությունների ամբողջական կատարում։ </w:t>
+        <w:t>Գրավի առարկայի իրացումից ստացված միջոցների հաշվին մարվում են իրացման օրվա դրությամբ Վարկատուի հանդեպ Վարկառուի ունեցած պարտավորությունները։ Եթե ստացված միջոցները գերազանցում են Վարկառուի իրացման օրվա դրությամբ ունեցած պարտավորությունները ապա գերազանցող մասը փոխանցվում է Վարկառուի բանկային հաշվեհամարին։ Եթե իրացումից ստացված միջոցները բավարար չեն պարտավորությունների ամբողջական կատարման համար Վարկա</w:t>
+      </w:r>
+      <w:r>
+        <w:rPr>
+          <w:rFonts w:ascii="Times New Roman" w:hAnsi="Times New Roman" w:cs="Times New Roman"/>
+          <w:sz w:val="18"/>
+          <w:szCs w:val="18"/>
+          <w:lang w:val="hy-AM"/>
+        </w:rPr>
+        <w:t>տ</w:t>
+      </w:r>
+      <w:r>
+        <w:rPr>
+          <w:rFonts w:ascii="Times New Roman" w:hAnsi="Times New Roman" w:cs="Times New Roman"/>
+          <w:sz w:val="18"/>
+          <w:szCs w:val="18"/>
+          <w:lang w:val="hy-AM"/>
+        </w:rPr>
+        <w:t xml:space="preserve">ուն իրավունք ունի օրենքով սահմանված կարգով Վարկառուից պահանջել չմարված վճարային պարտավորությունների ամբողջական կատարում։ </w:t>
       </w:r>
     </w:p>
     <w:p>
@@ -8700,46 +8718,7 @@
           <w:szCs w:val="18"/>
           <w:lang w:val="hy-AM"/>
         </w:rPr>
-        <w:t xml:space="preserve">Գրավատուն տեղեկացված լինելով, որ խաբեության, վստահությունը չարաշահելու կամ կեղծ տեղեկություն տարածելու կամ ապօրինի այլ եղանակով մեկ ուրիշին խոշոր չափերի գույքային վնաս պատճառելը հանցագործություն է և պատժվում է ՀՀ քրեական օրենսգրքի 259-րդ հոդվածով, հավաստիացնում է, որ գրավի առարկան չի համարվում </w:t>
-      </w:r>
-      <w:r>
-        <w:rPr>
-          <w:rFonts w:ascii="Times New Roman" w:hAnsi="Times New Roman" w:cs="Times New Roman"/>
-          <w:b/>
-          <w:bCs/>
-          <w:i/>
-          <w:iCs/>
-          <w:sz w:val="18"/>
-          <w:szCs w:val="18"/>
-          <w:lang w:val="hy-AM"/>
-        </w:rPr>
-        <w:t>համատեղ սեփականություն</w:t>
-      </w:r>
-      <w:r>
-        <w:rPr>
-          <w:rFonts w:ascii="Times New Roman" w:hAnsi="Times New Roman" w:cs="Times New Roman"/>
-          <w:b/>
-          <w:bCs/>
-          <w:i/>
-          <w:iCs/>
-          <w:sz w:val="18"/>
-          <w:szCs w:val="18"/>
-          <w:lang w:val="hy-AM"/>
-        </w:rPr>
-        <w:t>, քանի որ վերջինս ամուսնացած չէ, կամ գրավի առարկան ձեռք չի բերվել համատեղ ամուսնության ընթացքում</w:t>
-      </w:r>
-      <w:r>
-        <w:rPr>
-          <w:rFonts w:ascii="Times New Roman" w:hAnsi="Times New Roman" w:cs="Times New Roman"/>
-          <w:b/>
-          <w:bCs/>
-          <w:i/>
-          <w:iCs/>
-          <w:sz w:val="18"/>
-          <w:szCs w:val="18"/>
-          <w:lang w:val="hy-AM"/>
-        </w:rPr>
-        <w:t>։</w:t>
+        <w:t>Գրավատուն տեղեկացված լինելով, որ խաբեության, վստահությունը չարաշահելու կամ կեղծ տեղեկություն տարածելու կամ ապօրինի այլ եղանակով մեկ ուրիշին խոշոր չափերի գույքային վնաս պատճառելը հանցագործություն է և պատժվում է ՀՀ քրեական օրենսգրքի 259-րդ հոդվածով, հավաստիացնում է, որ գրավի առարկան չի համարվում համատեղ սեփականություն, քանի որ վերջինս ամուսնացած չէ, կամ գրավի առարկան ձեռք չի բերվել համատեղ ամուսնության ընթացքում կամ եթե գրավի առարկան համատեղ սեփականություն է ապա առկա է մյուս սեփականատիրոջ համաձայնությունը։</w:t>
       </w:r>
       <w:r>
         <w:rPr>
@@ -8993,7 +8972,34 @@
           <w:szCs w:val="18"/>
           <w:lang w:val="hy-AM"/>
         </w:rPr>
-        <w:t xml:space="preserve"> կետով նշված պարտավորությունը չկատարելու կամ ոչ պատշաճ կատարելու դեպքում Վարկառուն պարտավոր է Վարկատուն վճարել տուգանք </w:t>
+        <w:t xml:space="preserve"> կետով նշված պարտավորությունը չկատարելու կամ ոչ պատշաճ կատարելու դեպքում Վարկառուն պարտավոր է </w:t>
+      </w:r>
+      <w:r>
+        <w:rPr>
+          <w:rFonts w:ascii="Times New Roman" w:hAnsi="Times New Roman" w:cs="Times New Roman"/>
+          <w:sz w:val="18"/>
+          <w:szCs w:val="18"/>
+          <w:lang w:val="hy-AM"/>
+        </w:rPr>
+        <w:t>Վարկատուին</w:t>
+      </w:r>
+      <w:r>
+        <w:rPr>
+          <w:rFonts w:ascii="Times New Roman" w:hAnsi="Times New Roman" w:cs="Times New Roman"/>
+          <w:sz w:val="18"/>
+          <w:szCs w:val="18"/>
+          <w:lang w:val="hy-AM"/>
+        </w:rPr>
+        <w:t xml:space="preserve"> </w:t>
+      </w:r>
+      <w:r>
+        <w:rPr>
+          <w:rFonts w:ascii="Times New Roman" w:hAnsi="Times New Roman" w:cs="Times New Roman"/>
+          <w:sz w:val="18"/>
+          <w:szCs w:val="18"/>
+          <w:lang w:val="hy-AM"/>
+        </w:rPr>
+        <w:t xml:space="preserve">վճարել տուգանք </w:t>
       </w:r>
       <w:r>
         <w:rPr>
@@ -9142,7 +9148,34 @@
           <w:lang w:val="hy-AM"/>
         </w:rPr>
         <w:lastRenderedPageBreak/>
-        <w:t xml:space="preserve">Գրավի առարկայի պատկանելիության վերաբերյալ վեճ առաջանալու դեպքում, կամ Գրավի առարկան վեճի առարկա լինելու դեպքում, կամ այլ տեղեկություններ թաքցնելու, խեղաթյուրելու և այլ եղանակով Վարկատուին մոլորեցնելու, խաբելու կամ գրավի պայմանագիրը այլ նմանատիպ հանգամանքներում անվավեր ճանաչվելու կամ այդպիսի հնարավորության առկայության դեպքում Վարկառուն պարտավոր է Վարկատուին վճարել Վարկի ամբողջ գումարի 30 տոկոսի չափով տուգանք, որը համարվելու է Վարկառուի պարտավորությունների լրացուցիչ ապահովման միջոց։ Տուգանքը վճարելու պահանջով Բանկը պարտավոր չէ ապացուցել Վարկատուին պատճառված վնասների առկայությունը։ </w:t>
+        <w:t xml:space="preserve">Գրավի առարկայի պատկանելիության վերաբերյալ վեճ առաջանալու դեպքում, կամ Գրավի առարկան վեճի առարկա լինելու դեպքում, կամ այլ տեղեկություններ թաքցնելու, խեղաթյուրելու և այլ եղանակով Վարկատուին մոլորեցնելու, խաբելու կամ գրավի պայմանագիրը այլ նմանատիպ հանգամանքներում անվավեր ճանաչվելու կամ այդպիսի հնարավորության առկայության դեպքում Վարկառուն պարտավոր է Վարկատուին վճարել Վարկի ամբողջ գումարի 30 տոկոսի չափով տուգանք։ Տուգանքը վճարելու պահանջով </w:t>
+      </w:r>
+      <w:r>
+        <w:rPr>
+          <w:rFonts w:ascii="Times New Roman" w:hAnsi="Times New Roman" w:cs="Times New Roman"/>
+          <w:sz w:val="18"/>
+          <w:szCs w:val="18"/>
+          <w:lang w:val="hy-AM"/>
+        </w:rPr>
+        <w:t>Վարկային կազմակերպությունը</w:t>
+      </w:r>
+      <w:r>
+        <w:rPr>
+          <w:rFonts w:ascii="Times New Roman" w:hAnsi="Times New Roman" w:cs="Times New Roman"/>
+          <w:sz w:val="18"/>
+          <w:szCs w:val="18"/>
+          <w:lang w:val="hy-AM"/>
+        </w:rPr>
+        <w:t xml:space="preserve"> </w:t>
+      </w:r>
+      <w:r>
+        <w:rPr>
+          <w:rFonts w:ascii="Times New Roman" w:hAnsi="Times New Roman" w:cs="Times New Roman"/>
+          <w:sz w:val="18"/>
+          <w:szCs w:val="18"/>
+          <w:lang w:val="hy-AM"/>
+        </w:rPr>
+        <w:t xml:space="preserve">պարտավոր չէ ապացուցել Վարկատուին պատճառված վնասների առկայությունը։ </w:t>
       </w:r>
     </w:p>
     <w:p>
@@ -9606,97 +9639,106 @@
           <w:szCs w:val="18"/>
           <w:lang w:val="hy-AM"/>
         </w:rPr>
+        <w:t xml:space="preserve">Վարկառուն իրավունք ունի միակողմանիորեն փոխել Պայմանագրի </w:t>
+      </w:r>
+      <w:r>
+        <w:rPr>
+          <w:rFonts w:ascii="Times New Roman" w:hAnsi="Times New Roman" w:cs="Times New Roman"/>
+          <w:sz w:val="18"/>
+          <w:szCs w:val="18"/>
+          <w:lang w:val="hy-AM"/>
+        </w:rPr>
+        <w:fldChar w:fldCharType="begin"/>
+      </w:r>
+      <w:r>
+        <w:rPr>
+          <w:rFonts w:ascii="Times New Roman" w:hAnsi="Times New Roman" w:cs="Times New Roman"/>
+          <w:sz w:val="18"/>
+          <w:szCs w:val="18"/>
+          <w:lang w:val="hy-AM"/>
+        </w:rPr>
+        <w:instrText xml:space="preserve"> REF _Ref219254095 \r \h </w:instrText>
+      </w:r>
+      <w:r>
+        <w:rPr>
+          <w:rFonts w:ascii="Times New Roman" w:hAnsi="Times New Roman" w:cs="Times New Roman"/>
+          <w:sz w:val="18"/>
+          <w:szCs w:val="18"/>
+          <w:lang w:val="hy-AM"/>
+        </w:rPr>
+        <w:instrText xml:space="preserve"> \* MERGEFORMAT </w:instrText>
+      </w:r>
+      <w:r>
+        <w:rPr>
+          <w:rFonts w:ascii="Times New Roman" w:hAnsi="Times New Roman" w:cs="Times New Roman"/>
+          <w:sz w:val="18"/>
+          <w:szCs w:val="18"/>
+          <w:lang w:val="hy-AM"/>
+        </w:rPr>
+      </w:r>
+      <w:r>
+        <w:rPr>
+          <w:rFonts w:ascii="Times New Roman" w:hAnsi="Times New Roman" w:cs="Times New Roman"/>
+          <w:sz w:val="18"/>
+          <w:szCs w:val="18"/>
+          <w:lang w:val="hy-AM"/>
+        </w:rPr>
+        <w:fldChar w:fldCharType="separate"/>
+      </w:r>
+      <w:r>
+        <w:rPr>
+          <w:rFonts w:ascii="Times New Roman" w:hAnsi="Times New Roman" w:cs="Times New Roman"/>
+          <w:sz w:val="18"/>
+          <w:szCs w:val="18"/>
+          <w:lang w:val="hy-AM"/>
+        </w:rPr>
+        <w:t>6.1</w:t>
+      </w:r>
+      <w:r>
+        <w:rPr>
+          <w:rFonts w:ascii="Times New Roman" w:hAnsi="Times New Roman" w:cs="Times New Roman"/>
+          <w:sz w:val="18"/>
+          <w:szCs w:val="18"/>
+          <w:lang w:val="hy-AM"/>
+        </w:rPr>
+        <w:fldChar w:fldCharType="end"/>
+      </w:r>
+      <w:r>
+        <w:rPr>
+          <w:rFonts w:ascii="Times New Roman" w:hAnsi="Times New Roman" w:cs="Times New Roman"/>
+          <w:sz w:val="18"/>
+          <w:szCs w:val="18"/>
+          <w:lang w:val="hy-AM"/>
+        </w:rPr>
+        <w:t xml:space="preserve"> կետով սահմանված ծանուցման եղանակը պահանջելով Ծանուցումները ուղարկել </w:t>
+      </w:r>
+      <w:r>
+        <w:rPr>
+          <w:rFonts w:ascii="Times New Roman" w:hAnsi="Times New Roman" w:cs="Times New Roman"/>
+          <w:sz w:val="18"/>
+          <w:szCs w:val="18"/>
+          <w:lang w:val="hy-AM"/>
+        </w:rPr>
+        <w:t>մշտական բնակության հաշվ</w:t>
+      </w:r>
+      <w:r>
+        <w:rPr>
+          <w:rFonts w:ascii="Times New Roman" w:hAnsi="Times New Roman" w:cs="Times New Roman"/>
+          <w:sz w:val="18"/>
+          <w:szCs w:val="18"/>
+          <w:lang w:val="hy-AM"/>
+        </w:rPr>
+        <w:t xml:space="preserve">առման հասցեին, կամ փաստացի </w:t>
+      </w:r>
+      <w:r>
+        <w:rPr>
+          <w:rFonts w:ascii="Times New Roman" w:hAnsi="Times New Roman" w:cs="Times New Roman"/>
+          <w:sz w:val="18"/>
+          <w:szCs w:val="18"/>
+          <w:lang w:val="hy-AM"/>
+        </w:rPr>
         <w:lastRenderedPageBreak/>
-        <w:t xml:space="preserve">Վարկառուն իրավունք ունի միակողմանիորեն փոխել Պայմանագրի </w:t>
-      </w:r>
-      <w:r>
-        <w:rPr>
-          <w:rFonts w:ascii="Times New Roman" w:hAnsi="Times New Roman" w:cs="Times New Roman"/>
-          <w:sz w:val="18"/>
-          <w:szCs w:val="18"/>
-          <w:lang w:val="hy-AM"/>
-        </w:rPr>
-        <w:fldChar w:fldCharType="begin"/>
-      </w:r>
-      <w:r>
-        <w:rPr>
-          <w:rFonts w:ascii="Times New Roman" w:hAnsi="Times New Roman" w:cs="Times New Roman"/>
-          <w:sz w:val="18"/>
-          <w:szCs w:val="18"/>
-          <w:lang w:val="hy-AM"/>
-        </w:rPr>
-        <w:instrText xml:space="preserve"> REF _Ref219254095 \r \h </w:instrText>
-      </w:r>
-      <w:r>
-        <w:rPr>
-          <w:rFonts w:ascii="Times New Roman" w:hAnsi="Times New Roman" w:cs="Times New Roman"/>
-          <w:sz w:val="18"/>
-          <w:szCs w:val="18"/>
-          <w:lang w:val="hy-AM"/>
-        </w:rPr>
-        <w:instrText xml:space="preserve"> \* MERGEFORMAT </w:instrText>
-      </w:r>
-      <w:r>
-        <w:rPr>
-          <w:rFonts w:ascii="Times New Roman" w:hAnsi="Times New Roman" w:cs="Times New Roman"/>
-          <w:sz w:val="18"/>
-          <w:szCs w:val="18"/>
-          <w:lang w:val="hy-AM"/>
-        </w:rPr>
-      </w:r>
-      <w:r>
-        <w:rPr>
-          <w:rFonts w:ascii="Times New Roman" w:hAnsi="Times New Roman" w:cs="Times New Roman"/>
-          <w:sz w:val="18"/>
-          <w:szCs w:val="18"/>
-          <w:lang w:val="hy-AM"/>
-        </w:rPr>
-        <w:fldChar w:fldCharType="separate"/>
-      </w:r>
-      <w:r>
-        <w:rPr>
-          <w:rFonts w:ascii="Times New Roman" w:hAnsi="Times New Roman" w:cs="Times New Roman"/>
-          <w:sz w:val="18"/>
-          <w:szCs w:val="18"/>
-          <w:lang w:val="hy-AM"/>
-        </w:rPr>
-        <w:t>6.1</w:t>
-      </w:r>
-      <w:r>
-        <w:rPr>
-          <w:rFonts w:ascii="Times New Roman" w:hAnsi="Times New Roman" w:cs="Times New Roman"/>
-          <w:sz w:val="18"/>
-          <w:szCs w:val="18"/>
-          <w:lang w:val="hy-AM"/>
-        </w:rPr>
-        <w:fldChar w:fldCharType="end"/>
-      </w:r>
-      <w:r>
-        <w:rPr>
-          <w:rFonts w:ascii="Times New Roman" w:hAnsi="Times New Roman" w:cs="Times New Roman"/>
-          <w:sz w:val="18"/>
-          <w:szCs w:val="18"/>
-          <w:lang w:val="hy-AM"/>
-        </w:rPr>
-        <w:t xml:space="preserve"> կետով սահմանված ծանուցման եղանակը պահանջելով Ծանուցումները ուղարկել </w:t>
-      </w:r>
-      <w:r>
-        <w:rPr>
-          <w:rFonts w:ascii="Times New Roman" w:hAnsi="Times New Roman" w:cs="Times New Roman"/>
-          <w:sz w:val="18"/>
-          <w:szCs w:val="18"/>
-          <w:lang w:val="hy-AM"/>
-        </w:rPr>
-        <w:t>մշտական բնակության հաշվ</w:t>
-      </w:r>
-      <w:r>
-        <w:rPr>
-          <w:rFonts w:ascii="Times New Roman" w:hAnsi="Times New Roman" w:cs="Times New Roman"/>
-          <w:sz w:val="18"/>
-          <w:szCs w:val="18"/>
-          <w:lang w:val="hy-AM"/>
-        </w:rPr>
-        <w:t xml:space="preserve">առման հասցեին, կամ փաստացի բնակության հասցեին, կամ կապի հաղորդակցության այլ </w:t>
+        <w:t xml:space="preserve">բնակության հասցեին, կամ կապի հաղորդակցության այլ </w:t>
       </w:r>
       <w:r>
         <w:rPr>
@@ -10421,7 +10463,6 @@
           <w:szCs w:val="28"/>
           <w:lang w:val="hy-AM"/>
         </w:rPr>
-        <w:lastRenderedPageBreak/>
         <w:t>Կողմերը</w:t>
       </w:r>
     </w:p>
@@ -10472,6 +10513,7 @@
                 <w:u w:val="single"/>
                 <w:lang w:val="hy-AM"/>
               </w:rPr>
+              <w:lastRenderedPageBreak/>
               <w:t>Վարկառու</w:t>
             </w:r>
           </w:p>
@@ -16551,7 +16593,6 @@
   <w:style w:type="character" w:default="1" w:styleId="DefaultParagraphFont">
     <w:name w:val="Default Paragraph Font"/>
     <w:uiPriority w:val="1"/>
-    <w:semiHidden/>
     <w:unhideWhenUsed/>
   </w:style>
   <w:style w:type="table" w:default="1" w:styleId="TableNormal">

</xml_diff>